<commit_message>
Content: pull the $110K AWS figure, swap in 93% control-plane authorship tile
</commit_message>
<xml_diff>
--- a/resume/resume.docx
+++ b/resume/resume.docx
@@ -83,7 +83,7 @@
         <w:t xml:space="preserve">Primary author of both generations of the fleet's core REST API </w:t>
       </w:r>
       <w:r>
-        <w:t xml:space="preserve">- 58% of v1, which still serves most of the fleet, and 78% of v2, which serves the first two tenants - owning the multi-tenant auth, data-access and Oracle CCS (OAuth 2.0) integration patterns both generations share.</w:t>
+        <w:t xml:space="preserve">- 58% of v1, which serves all seven launched tenants, and 78% of v2, in production for the first tenant ahead of its cutover - owning the multi-tenant auth, data-access and Oracle CCS (OAuth 2.0) integration patterns both generations share.</w:t>
       </w:r>
     </w:p>
     <w:p>
@@ -191,7 +191,7 @@
         <w:t xml:space="preserve">Own and operate the multi-tenant portal infrastructure as sole platform engineer </w:t>
       </w:r>
       <w:r>
-        <w:t xml:space="preserve">- ~$110K/year of AWS across the 7-tenant production and test fleet - with CI/CD (Bitbucket Pipelines), Datadog / CloudWatch observability, on-call incident response, and cost-attribution tooling (Cost Explorer API) driving right-sizing, shared-ALB, and Fargate-Spot savings.</w:t>
+        <w:t xml:space="preserve">- the 7-tenant production and test fleet - with CI/CD (Bitbucket Pipelines), Datadog / CloudWatch observability, on-call incident response, and cost-attribution tooling (Cost Explorer API) driving right-sizing, shared-ALB, and Fargate-Spot savings.</w:t>
       </w:r>
     </w:p>
     <w:p>

</xml_diff>

<commit_message>
Audit: fix ATS tenure parse, DOCX contract label, stale and overstated claims
</commit_message>
<xml_diff>
--- a/resume/resume.docx
+++ b/resume/resume.docx
@@ -33,7 +33,7 @@
     </w:p>
     <w:p>
       <w:r>
-        <w:t xml:space="preserve">Staff Software Engineer - I build the platform other engineers ship on. 8+ years in software, 5+ on AWS, ~3 leading a multi-tenant SaaS platform: primary author (93%) of the Terraform control-plane the fleet is migrating onto, primary author of both generations of the core REST API behind 7 utility client portals (58% of v1, 78% of v2), and its operator - CI/CD, observability, on-call, cost.</w:t>
+        <w:t xml:space="preserve">Staff Software Engineer - I build the platform other engineers ship on. 8+ years in software, 5+ on AWS, ~3 leading a multi-tenant SaaS platform: primary author (93%) of the Terraform control-plane the fleet is migrating onto, primary author of the core REST API behind 7 live utility client portals (58% of the v1 serving them today) and of its v2 successor (78%), now in production for the first tenant ahead of its cutover - and its operator: CI/CD, observability, on-call, cost.</w:t>
       </w:r>
     </w:p>
     <w:p>
@@ -60,7 +60,12 @@
         <w:t xml:space="preserve">ESC Partners / HometownHUB</w:t>
       </w:r>
       <w:r>
-        <w:t xml:space="preserve"> - New York, USA (Remote) | Sep 2025 - Present</w:t>
+        <w:t xml:space="preserve"> - New York, USA (Remote), contract | May 2023 - Present</w:t>
+      </w:r>
+    </w:p>
+    <w:p>
+      <w:r>
+        <w:t xml:space="preserve">Staff Software Engineer, Platform &amp; Product | Sep 2025 - Present</w:t>
       </w:r>
     </w:p>
     <w:p>
@@ -152,10 +157,10 @@
         <w:rPr>
           <w:b/>
         </w:rPr>
-        <w:t xml:space="preserve">Built an automated batch pipeline </w:t>
-      </w:r>
-      <w:r>
-        <w:t xml:space="preserve">syncing multi-account customers between Oracle CCS and Invoice Cloud in 5K-record batches - idempotency checks, error tracking, and automated success/failure email reporting.</w:t>
+        <w:t xml:space="preserve">Own the reconciliation between two systems of record </w:t>
+      </w:r>
+      <w:r>
+        <w:t xml:space="preserve">- a detection-only CCS/Invoice Cloud reconciler running four times daily in production as a scheduled Lambda, with per-tenant population queries, pre-flight link checks returning a reasoned verdict, and split-identity healing; it replaced the batch sync I built and retired.</w:t>
       </w:r>
     </w:p>
     <w:p>
@@ -264,7 +269,7 @@
         <w:t xml:space="preserve">Nmblr - Biopharma Strategy &amp; Collaboration Platform</w:t>
       </w:r>
       <w:r>
-        <w:t xml:space="preserve"> - London, UK (Remote) | Mar 2024 - Present</w:t>
+        <w:t xml:space="preserve"> - London, UK (Remote), contract | Mar 2024 - Present</w:t>
       </w:r>
     </w:p>
     <w:p>
@@ -426,7 +431,7 @@
         </w:numPr>
       </w:pPr>
       <w:r>
-        <w:t xml:space="preserve">Full-stack web development for studio and commerce clients (React, Node.js).</w:t>
+        <w:t xml:space="preserve">Full-stack web development for studio and commerce clients (React, Node.js), deployed and operated on AWS Elastic Beanstalk.</w:t>
       </w:r>
     </w:p>
     <w:p>
@@ -470,7 +475,7 @@
         <w:t xml:space="preserve">Cloud &amp; Infra: </w:t>
       </w:r>
       <w:r>
-        <w:t xml:space="preserve">AWS - ECS Fargate, CloudFront, Cognito, RDS, ElastiCache, KMS, Secrets Manager, WAFv2, SES, S3, Route 53, VPC, ALB, Elastic Beanstalk, Terraform, Docker, Kubernetes, Linux, OpenSearch</w:t>
+        <w:t xml:space="preserve">AWS - ECS Fargate, CloudFront, Cognito, ElastiCache, KMS, Secrets Manager, WAFv2, SES, S3, Route 53, VPC, ALB, IAM, Elastic Beanstalk, Terraform, Docker, Linux</w:t>
       </w:r>
     </w:p>
     <w:p>
@@ -492,7 +497,7 @@
         <w:t xml:space="preserve">AI on the Platform: </w:t>
       </w:r>
       <w:r>
-        <w:t xml:space="preserve">AWS Bedrock (Claude), AIOps auto-remediation, Agentic SDLC pipelines, AI code review, LLM knowledge bases</w:t>
+        <w:t xml:space="preserve">AWS Bedrock (Claude), AI code review in CI, LLM knowledge bases (RAG), Evaluating and retiring AI tooling</w:t>
       </w:r>
     </w:p>
     <w:p>
@@ -503,7 +508,7 @@
         <w:t xml:space="preserve">Backend &amp; Data: </w:t>
       </w:r>
       <w:r>
-        <w:t xml:space="preserve">Node.js - Fastify, Express, TypeScript, Python, REST APIs, GraphQL, Prisma, PostgreSQL, MongoDB, Redis/BullMQ, Oracle Utilities CCS, Invoice Cloud</w:t>
+        <w:t xml:space="preserve">Node.js - Fastify, Express, TypeScript, Python, REST APIs, GraphQL, Prisma, PostgreSQL, MongoDB, Zod, Vitest, Playwright, Oracle Utilities CCS, Invoice Cloud</w:t>
       </w:r>
     </w:p>
     <w:p>
@@ -514,7 +519,7 @@
         <w:t xml:space="preserve">Observability &amp; Security: </w:t>
       </w:r>
       <w:r>
-        <w:t xml:space="preserve">Datadog RUM/APM, CloudWatch, Sentry, Structured logging, OWASP/IDOR, JWT, WAFv2, Snyk</w:t>
+        <w:t xml:space="preserve">Datadog RUM/APM, CloudWatch, Sentry, Structured logging, Session Replay, OWASP/IDOR, JWT, OAuth 2.0, OIDC, IAM, WAFv2, Snyk, Pentest remediation</w:t>
       </w:r>
     </w:p>
     <w:p>

</xml_diff>

<commit_message>
Content: add the missing platform and product stories
Twelve receipts drafted from merged-PR evidence and verified against it:
eight for the platform client (pentest remediation program, runtime
feature-flag platform, reconciler drift repair, multi-party authorization
model, customer-360 admin product, RUM/Session Replay rollout, CRA-to-Vite
modernization with new test suites, per-tenant release engineering) and
four for the product client (observability layer he built, concurrency and
data-integrity fixes, design-system primitive rollout, schema evolution).

Resume swaps within the 2-page budget: pentest program replaces the Snyk
bullet, feature-flag platform replaces the audit trail; the product-client
observability bullet now leads with the layer built, not the cost cut, and
the concurrency bullet replaces the "contributed to" line.

Site receipts reordered so the LinkedIn renderer keeps the flagship and
platform stories in its 2000-char window.
</commit_message>
<xml_diff>
--- a/resume/resume.docx
+++ b/resume/resume.docx
@@ -139,10 +139,10 @@
         <w:rPr>
           <w:b/>
         </w:rPr>
-        <w:t xml:space="preserve">Rolled blocking Snyk gates across the portal pipelines </w:t>
-      </w:r>
-      <w:r>
-        <w:t xml:space="preserve">- scan first, ahead of build and deploy - then keyless OIDC deploys through pilot, all test environments, and production on 4 repositories, taking long-lived AWS credentials out of the deploy path.</w:t>
+        <w:t xml:space="preserve">Ran the remediation program for 6 rounds of external penetration testing </w:t>
+      </w:r>
+      <w:r>
+        <w:t xml:space="preserve">- triaged 60 findings into severity-labelled batches (IDOR, unauthenticated endpoints, URL-borne tokens, client-side privilege checks, missing rate limits), then blocking Snyk gates and keyless OIDC deploys took long-lived AWS keys out of the deploy path.</w:t>
       </w:r>
     </w:p>
     <w:p>
@@ -229,10 +229,10 @@
         <w:rPr>
           <w:b/>
         </w:rPr>
-        <w:t xml:space="preserve">Built the fleet-wide interaction audit trail </w:t>
-      </w:r>
-      <w:r>
-        <w:t xml:space="preserve">- a capture hook for authenticated actions and page views, a tenant-scoped, IDOR-safe admin history API with CSV export and rate limiting - then extended it to admin reads and impersonated sessions attributed to the acting admin; one composite index took its sessions view from 102 seconds to 2.4.</w:t>
+        <w:t xml:space="preserve">Built a runtime feature-flag platform </w:t>
+      </w:r>
+      <w:r>
+        <w:t xml:space="preserve">- flags moved from build-time env vars to a MongoDB-backed runtime reader with change-stream SSE push and fail-open on outage, wired into 6 v1 tenants' admin consoles and 4 customer portals and enabled per tenant behind a gate, with a flag manifest and parity tests guarding tenants still on compile-time flags.</w:t>
       </w:r>
     </w:p>
     <w:p>
@@ -311,19 +311,43 @@
         </w:numPr>
       </w:pPr>
       <w:r>
+        <w:rPr>
+          <w:b/>
+        </w:rPr>
+        <w:t xml:space="preserve">Serialized concurrent writes and killed data races: </w:t>
+      </w:r>
+      <w:r>
+        <w:t xml:space="preserve">wrapped rating upserts in a transaction behind a Postgres advisory lock (pg_advisory_xact_lock), fixed a duplicate-row race in a GraphQL sync resolver, blocked re-entrant AI generation calls, made optimistic cache creates idempotent by id, and reconciled stale polls that hid new rows.</w:t>
+      </w:r>
+    </w:p>
+    <w:p>
+      <w:pPr>
+        <w:pStyle w:val="ListParagraph"/>
+        <w:numPr>
+          <w:ilvl w:val="0"/>
+          <w:numId w:val="1"/>
+        </w:numPr>
+      </w:pPr>
+      <w:r>
+        <w:rPr>
+          <w:b/>
+        </w:rPr>
+        <w:t xml:space="preserve">Built the in-house observability layer: </w:t>
+      </w:r>
+      <w:r>
+        <w:t xml:space="preserve">an Apollo plugin emitting one structured obs_event per GraphQL operation to CloudWatch, an errClass fault/reject/noise scheme, staging and production dashboards, Beanstalk logs streamed to CloudWatch, Sentry hardened (tunnel, sourcemaps, gated replay) - then removed a dead-pipe New Relic billing ~$176/month.</w:t>
+      </w:r>
+    </w:p>
+    <w:p>
+      <w:pPr>
+        <w:pStyle w:val="ListParagraph"/>
+        <w:numPr>
+          <w:ilvl w:val="0"/>
+          <w:numId w:val="1"/>
+        </w:numPr>
+      </w:pPr>
+      <w:r>
         <w:t xml:space="preserve">Contributed to real-time collaboration (GraphQL subscriptions), OpenAI-backed generation features, and platform security (OWASP/IDOR, JWT sessions).</w:t>
-      </w:r>
-    </w:p>
-    <w:p>
-      <w:pPr>
-        <w:pStyle w:val="ListParagraph"/>
-        <w:numPr>
-          <w:ilvl w:val="0"/>
-          <w:numId w:val="1"/>
-        </w:numPr>
-      </w:pPr>
-      <w:r>
-        <w:t xml:space="preserve">Added production observability - streamed Elastic Beanstalk logs to CloudWatch with enhanced health reporting - and contributed to CI/CD workflow tuning.</w:t>
       </w:r>
     </w:p>
     <w:p>

</xml_diff>

<commit_message>
Resume: carry duplicate-login reconciler and Notion KB into the CV
Two resumeReceipts bullets rewritten within the 360-char cap; PDF stays at 2 pages.
</commit_message>
<xml_diff>
--- a/resume/resume.docx
+++ b/resume/resume.docx
@@ -157,10 +157,10 @@
         <w:rPr>
           <w:b/>
         </w:rPr>
-        <w:t xml:space="preserve">Own the reconciliation between two systems of record </w:t>
-      </w:r>
-      <w:r>
-        <w:t xml:space="preserve">- a detection-only CCS/Invoice Cloud reconciler running four times daily in production as a scheduled Lambda, with per-tenant population queries, pre-flight link checks returning a reasoned verdict, and split-identity healing; it replaced the batch sync I built and retired.</w:t>
+        <w:t xml:space="preserve">Own the reconciliation between systems of record </w:t>
+      </w:r>
+      <w:r>
+        <w:t xml:space="preserve">- a detection-only CCS/Invoice Cloud reconciler (4x daily Lambda, per-tenant queries, pre-flight link checks, split-identity healing) that replaced the batch sync I retired, plus a dry-run-default duplicate-login reconciler with a daily read-only prod sweep.</w:t>
       </w:r>
     </w:p>
     <w:p>
@@ -347,7 +347,7 @@
         </w:numPr>
       </w:pPr>
       <w:r>
-        <w:t xml:space="preserve">Contributed to real-time collaboration (GraphQL subscriptions), OpenAI-backed generation features, and platform security (OWASP/IDOR, JWT sessions); built AI Context Configuration - a per-strategy, per-user assistant response mode only a non-external strategy lead can choose, clamped on read and refused on write otherwise - plus help-centre retrieval.</w:t>
+        <w:t xml:space="preserve">Contributed to real-time collaboration (GraphQL subscriptions), OpenAI-backed generation and platform security (OWASP/IDOR, JWT sessions); built AI Context Configuration - a per-strategy assistant response mode only a non-external strategy lead can choose - plus a Notion-backed assistant knowledge base and AI-endpoint hardening.</w:t>
       </w:r>
     </w:p>
     <w:p>

</xml_diff>

<commit_message>
Content: weaken five unevidenced claims after accuracy audit
</commit_message>
<xml_diff>
--- a/resume/resume.docx
+++ b/resume/resume.docx
@@ -33,7 +33,7 @@
     </w:p>
     <w:p>
       <w:r>
-        <w:t xml:space="preserve">Staff Software Engineer - I build the platform other engineers ship on. 8+ years in software, 5+ on AWS, ~3 leading a multi-tenant SaaS platform: primary author (93%) of the Terraform control-plane the fleet is migrating onto, primary author of the core REST API behind 7 live utility client portals (58% of the v1 serving them today) and of its v2 successor (78%), now in production for the first tenant ahead of its cutover - and its operator: CI/CD, observability, on-call, cost.</w:t>
+        <w:t xml:space="preserve">Staff Software Engineer - I build the platform other engineers ship on. 8+ years in software, 5+ on AWS, 3+ building and operating a multi-tenant SaaS platform as its most senior engineer: primary author (93%) of the Terraform control-plane the fleet is migrating onto, primary author of the core REST API behind 7 live utility client portals (58% of the v1 serving them today) and of its v2 successor (78%), now in production for the first tenant ahead of its cutover - and its operator: CI/CD, observability, on-call, cost.</w:t>
       </w:r>
     </w:p>
     <w:p>
@@ -121,10 +121,10 @@
         <w:rPr>
           <w:b/>
         </w:rPr>
-        <w:t xml:space="preserve">De-facto technical lead of a 5-engineer team </w:t>
-      </w:r>
-      <w:r>
-        <w:t xml:space="preserve">- most senior hands-on engineer, reporting to the COO/CEO; set the platform standards the fleet adopts (provisioning modules, CI/CD, security guardrails).</w:t>
+        <w:t xml:space="preserve">Most senior hands-on engineer on a small product team </w:t>
+      </w:r>
+      <w:r>
+        <w:t xml:space="preserve">- set the platform standards the fleet adopts (provisioning modules, CI/CD, security guardrails).</w:t>
       </w:r>
     </w:p>
     <w:p>
@@ -247,10 +247,10 @@
         <w:rPr>
           <w:b/>
         </w:rPr>
-        <w:t xml:space="preserve">Owned production go-live readiness for 6 client launches </w:t>
-      </w:r>
-      <w:r>
-        <w:t xml:space="preserve">- primary engineer on four, core contributor on two - environment validation, deployment, rollback planning, and stabilization.</w:t>
+        <w:t xml:space="preserve">Owned production go-live readiness for client launches across the fleet </w:t>
+      </w:r>
+      <w:r>
+        <w:t xml:space="preserve">- environment validation, deployment, rollback planning, and stabilization.</w:t>
       </w:r>
     </w:p>
     <w:p>

</xml_diff>

<commit_message>
Content: apply claim-by-claim accuracy audit and site fixes
</commit_message>
<xml_diff>
--- a/resume/resume.docx
+++ b/resume/resume.docx
@@ -1,6 +1,6 @@
 
 <file path=word/document.xml><?xml version="1.0" encoding="utf-8"?>
-<w:document xmlns:w="http://schemas.openxmlformats.org/wordprocessingml/2006/main">
+<w:document xmlns:w="http://schemas.openxmlformats.org/wordprocessingml/2006/main" xmlns:r="http://schemas.openxmlformats.org/officeDocument/2006/relationships">
   <w:body>
     <w:p>
       <w:pPr>
@@ -20,8 +20,40 @@
     </w:p>
     <w:p>
       <w:r>
-        <w:t xml:space="preserve">Italy (Remote) | jajapabatao@gmail.com | linkedin.com/in/benedict-pabatao | github.com/bpabatao | bpabatao.github.io</w:t>
-      </w:r>
+        <w:t xml:space="preserve">Italy (Remote)</w:t>
+      </w:r>
+      <w:r>
+        <w:t xml:space="preserve"> | </w:t>
+      </w:r>
+      <w:hyperlink r:id="rIdL0" w:history="1">
+        <w:r>
+          <w:t xml:space="preserve">jajapabatao@gmail.com</w:t>
+        </w:r>
+      </w:hyperlink>
+      <w:r>
+        <w:t xml:space="preserve"> | </w:t>
+      </w:r>
+      <w:hyperlink r:id="rIdL1" w:history="1">
+        <w:r>
+          <w:t xml:space="preserve">linkedin.com/in/benedict-pabatao</w:t>
+        </w:r>
+      </w:hyperlink>
+      <w:r>
+        <w:t xml:space="preserve"> | </w:t>
+      </w:r>
+      <w:hyperlink r:id="rIdL2" w:history="1">
+        <w:r>
+          <w:t xml:space="preserve">github.com/bpabatao</w:t>
+        </w:r>
+      </w:hyperlink>
+      <w:r>
+        <w:t xml:space="preserve"> | </w:t>
+      </w:r>
+      <w:hyperlink r:id="rIdL3" w:history="1">
+        <w:r>
+          <w:t xml:space="preserve">bpabatao.github.io</w:t>
+        </w:r>
+      </w:hyperlink>
     </w:p>
     <w:p>
       <w:pPr>
@@ -33,7 +65,7 @@
     </w:p>
     <w:p>
       <w:r>
-        <w:t xml:space="preserve">Staff Software Engineer - I build the platform other engineers ship on. 8+ years in software, 5+ on AWS, 3+ building and operating a multi-tenant SaaS platform as its most senior engineer: primary author (93%) of the Terraform control-plane the fleet is migrating onto, primary author of the core REST API behind 7 live utility client portals (58% of the v1 serving them today) and of its v2 successor (78%), now in production for the first tenant ahead of its cutover - and its operator: CI/CD, observability, on-call, cost.</w:t>
+        <w:t xml:space="preserve">Staff Software Engineer - I build the platform other engineers ship on. 8+ years in software, 5+ on AWS, 3+ building and operating a multi-tenant SaaS platform as its most senior engineer: primary author (93%) of the Terraform control-plane the fleet is migrating onto, primary author of the core REST API behind 7 live utility client portals (58% of the v1 serving them today) and of its v2 successor (76%), now in production for the first tenant ahead of its cutover - and its operator: CI/CD, observability, incident response, cost.</w:t>
       </w:r>
     </w:p>
     <w:p>
@@ -88,7 +120,7 @@
         <w:t xml:space="preserve">Primary author of both generations of the fleet's core REST API </w:t>
       </w:r>
       <w:r>
-        <w:t xml:space="preserve">- 58% of v1, which serves all seven launched tenants, and 78% of v2, in production for the first tenant ahead of its cutover - owning the multi-tenant auth, data-access and Oracle CCS (OAuth 2.0) integration patterns both generations share.</w:t>
+        <w:t xml:space="preserve">- 58% of v1, which serves all seven launched tenants, and 76% of v2, in production for the first tenant ahead of its cutover - owning the multi-tenant auth, data-access and Oracle CCS (OAuth 2.0) integration patterns both generations share.</w:t>
       </w:r>
     </w:p>
     <w:p>
@@ -142,7 +174,7 @@
         <w:t xml:space="preserve">Ran the remediation program for 6 rounds of external penetration testing </w:t>
       </w:r>
       <w:r>
-        <w:t xml:space="preserve">- triaged 60 findings into severity-labelled batches (IDOR, unauthenticated endpoints, URL-borne tokens, client-side privilege checks, missing rate limits), then blocking Snyk gates and keyless OIDC deploys took long-lived AWS keys out of the deploy path.</w:t>
+        <w:t xml:space="preserve">- triaged 60 findings into severity-labelled batches (IDOR, unauthenticated endpoints, URL-borne tokens, client-side privilege checks, missing rate limits), then added blocking Snyk gates and moved 4 repos to keyless OIDC deploys.</w:t>
       </w:r>
     </w:p>
     <w:p>
@@ -160,7 +192,7 @@
         <w:t xml:space="preserve">Own the reconciliation between systems of record </w:t>
       </w:r>
       <w:r>
-        <w:t xml:space="preserve">- a detection-only CCS/Invoice Cloud reconciler (4x daily Lambda, per-tenant queries, pre-flight link checks, split-identity healing) that replaced the batch sync I retired, plus a dry-run-default duplicate-login reconciler with a daily read-only prod sweep.</w:t>
+        <w:t xml:space="preserve">- a CCS/Invoice Cloud reconciler (scheduled Lambda: detection-only reconcile, guarded desync repair, per-tenant queries, pre-flight link checks, split-identity healing) that replaced the batch sync I switched off, plus a dry-run-default duplicate-login reconciler with a daily read-only prod sweep.</w:t>
       </w:r>
     </w:p>
     <w:p>
@@ -178,25 +210,25 @@
         <w:t xml:space="preserve">Built, measured and pruned the team's AI tooling </w:t>
       </w:r>
       <w:r>
-        <w:t xml:space="preserve">- kept a Claude PR reviewer in CI on the core API and backend, shelved a Bedrock auto-remediation service that was never wired to a live alarm, shipped a Bedrock knowledge-base agent (curated-first retrieval, flagged SQL fallback), and designed a ticket-to-PR pipeline with human gates, not yet live.</w:t>
-      </w:r>
-    </w:p>
-    <w:p>
-      <w:pPr>
-        <w:pStyle w:val="ListParagraph"/>
-        <w:numPr>
-          <w:ilvl w:val="0"/>
-          <w:numId w:val="1"/>
-        </w:numPr>
-      </w:pPr>
-      <w:r>
-        <w:rPr>
-          <w:b/>
-        </w:rPr>
-        <w:t xml:space="preserve">Own and operate the multi-tenant portal infrastructure as sole platform engineer </w:t>
-      </w:r>
-      <w:r>
-        <w:t xml:space="preserve">- the 7-tenant production and test fleet - with CI/CD (Bitbucket Pipelines), Datadog / CloudWatch observability, on-call incident response, and cost-attribution tooling (Cost Explorer API) driving right-sizing, shared-ALB, and Fargate-Spot savings.</w:t>
+        <w:t xml:space="preserve">- kept a Claude PR reviewer in CI across the API and portal repos, shelved a Bedrock auto-remediation service after 12 of 13 runs failed, shipped a Bedrock knowledge-base agent (curated-first retrieval, flagged SQL fallback), and designed a ticket-to-PR pipeline with human gates, not yet live.</w:t>
+      </w:r>
+    </w:p>
+    <w:p>
+      <w:pPr>
+        <w:pStyle w:val="ListParagraph"/>
+        <w:numPr>
+          <w:ilvl w:val="0"/>
+          <w:numId w:val="1"/>
+        </w:numPr>
+      </w:pPr>
+      <w:r>
+        <w:rPr>
+          <w:b/>
+        </w:rPr>
+        <w:t xml:space="preserve">Own and operate the multi-tenant portal infrastructure as primary platform engineer </w:t>
+      </w:r>
+      <w:r>
+        <w:t xml:space="preserve">- the 11-tenant production and test fleet (7 live) - with CI/CD (Bitbucket Pipelines), CloudWatch observability, incident response, cost-attribution tooling (Cost Explorer API), a shared ALB and Fargate Spot on the test fleet.</w:t>
       </w:r>
     </w:p>
     <w:p>
@@ -480,7 +512,7 @@
         </w:numPr>
       </w:pPr>
       <w:r>
-        <w:t xml:space="preserve">Built customer and rider mobile applications (React Native).</w:t>
+        <w:t xml:space="preserve">Built customer and rider mobile applications (Ionic).</w:t>
       </w:r>
     </w:p>
     <w:p>
@@ -521,7 +553,7 @@
         <w:t xml:space="preserve">AI on the Platform: </w:t>
       </w:r>
       <w:r>
-        <w:t xml:space="preserve">AWS Bedrock (Claude), AI code review in CI, LLM knowledge bases (RAG), Evaluating and retiring AI tooling</w:t>
+        <w:t xml:space="preserve">AWS Bedrock (Claude), AI code review in CI, LLM knowledge bases (RAG), Evaluating and pruning AI tooling</w:t>
       </w:r>
     </w:p>
     <w:p>

</xml_diff>

<commit_message>
Content: fix diagram accuracy and lead with strongest claims
</commit_message>
<xml_diff>
--- a/resume/resume.docx
+++ b/resume/resume.docx
@@ -65,7 +65,7 @@
     </w:p>
     <w:p>
       <w:r>
-        <w:t xml:space="preserve">Staff Software Engineer - I build the platform other engineers ship on. 8+ years in software, 5+ on AWS, 3+ building and operating a multi-tenant SaaS platform as its most senior engineer: primary author (93%) of the Terraform control-plane the fleet is migrating onto, primary author of the core REST API behind 7 live utility client portals (58% of the v1 serving them today) and of its v2 successor (76%), now in production for the first tenant ahead of its cutover - and its operator: CI/CD, observability, incident response, cost.</w:t>
+        <w:t xml:space="preserve">Staff Software Engineer - I build the platform other engineers ship on. 8+ years in software, 5+ on AWS, 3+ as the most senior hands-on engineer on a multi-tenant SaaS platform behind 7 live utility client portals. Primary author of the Terraform control-plane the fleet is migrating onto (93%) and of both generations of its core REST API (58% of v1, which serves all of them today; 76% of v2, in production for the first tenant ahead of its cutover). Also its operator: CI/CD, observability, incident response, security remediation and cost.</w:t>
       </w:r>
     </w:p>
     <w:p>
@@ -120,7 +120,7 @@
         <w:t xml:space="preserve">Primary author of both generations of the fleet's core REST API </w:t>
       </w:r>
       <w:r>
-        <w:t xml:space="preserve">- 58% of v1, which serves all seven launched tenants, and 76% of v2, in production for the first tenant ahead of its cutover - owning the multi-tenant auth, data-access and Oracle CCS (OAuth 2.0) integration patterns both generations share.</w:t>
+        <w:t xml:space="preserve">- 58% of v1, which serves all seven launched tenants, and 76% of v2 (Fastify, TypeScript, Zod, MongoDB on ECS Fargate), in production for the first tenant ahead of its cutover - owning the multi-tenant auth, data-access and Oracle CCS (OAuth 2.0) integration patterns both generations share.</w:t>
       </w:r>
     </w:p>
     <w:p>
@@ -153,28 +153,118 @@
         <w:rPr>
           <w:b/>
         </w:rPr>
-        <w:t xml:space="preserve">Most senior hands-on engineer on a small product team </w:t>
-      </w:r>
-      <w:r>
-        <w:t xml:space="preserve">- set the platform standards the fleet adopts (provisioning modules, CI/CD, security guardrails).</w:t>
-      </w:r>
-    </w:p>
-    <w:p>
-      <w:pPr>
-        <w:pStyle w:val="ListParagraph"/>
-        <w:numPr>
-          <w:ilvl w:val="0"/>
-          <w:numId w:val="1"/>
-        </w:numPr>
-      </w:pPr>
-      <w:r>
-        <w:rPr>
-          <w:b/>
-        </w:rPr>
-        <w:t xml:space="preserve">Ran the remediation program for 6 rounds of external penetration testing </w:t>
-      </w:r>
-      <w:r>
-        <w:t xml:space="preserve">- triaged 60 findings into severity-labelled batches (IDOR, unauthenticated endpoints, URL-borne tokens, client-side privilege checks, missing rate limits), then added blocking Snyk gates and moved 4 repos to keyless OIDC deploys.</w:t>
+        <w:t xml:space="preserve">Most senior hands-on engineer on a small product team; primary platform engineer </w:t>
+      </w:r>
+      <w:r>
+        <w:t xml:space="preserve">for the 11-tenant prod and test fleet (7 live) - set fleet standards (provisioning modules, CI/CD, security guardrails); run Bitbucket Pipelines, CloudWatch, incident response, Cost Explorer cost attribution, shared ALB, test-fleet Fargate Spot.</w:t>
+      </w:r>
+    </w:p>
+    <w:p>
+      <w:pPr>
+        <w:pStyle w:val="ListParagraph"/>
+        <w:numPr>
+          <w:ilvl w:val="0"/>
+          <w:numId w:val="1"/>
+        </w:numPr>
+      </w:pPr>
+      <w:r>
+        <w:rPr>
+          <w:b/>
+        </w:rPr>
+        <w:t xml:space="preserve">Ran the remediation program for 6 external pentest rounds </w:t>
+      </w:r>
+      <w:r>
+        <w:t xml:space="preserve">- triaged 60 findings into severity-labelled batches (IDOR, unauthenticated endpoints, URL-borne tokens, client-side privilege checks, missing rate limits).</w:t>
+      </w:r>
+    </w:p>
+    <w:p>
+      <w:pPr>
+        <w:pStyle w:val="ListParagraph"/>
+        <w:numPr>
+          <w:ilvl w:val="0"/>
+          <w:numId w:val="1"/>
+        </w:numPr>
+      </w:pPr>
+      <w:r>
+        <w:rPr>
+          <w:b/>
+        </w:rPr>
+        <w:t xml:space="preserve">Shipped the fix for an SSN identity-verification gap enabling account takeover </w:t>
+      </w:r>
+      <w:r>
+        <w:t xml:space="preserve">- the last-four plus street match resolved to the wrong person on ~2.4% of one tenant's accounts - as attempt lockout plus ZIP-based disambiguation against the brute-forceable last-4 space, flag-gated for per-tenant rollout.</w:t>
+      </w:r>
+    </w:p>
+    <w:p>
+      <w:pPr>
+        <w:pStyle w:val="ListParagraph"/>
+        <w:numPr>
+          <w:ilvl w:val="0"/>
+          <w:numId w:val="1"/>
+        </w:numPr>
+      </w:pPr>
+      <w:r>
+        <w:rPr>
+          <w:b/>
+        </w:rPr>
+        <w:t xml:space="preserve">Faster, stricter delivery </w:t>
+      </w:r>
+      <w:r>
+        <w:t xml:space="preserve">- core API pipeline ~12 to ~7 min (esbuild transpile, cache-mounted installs, fail-fast), admin portal ~10 to ~6 min (April 2026), plus blocking portal Snyk gates and keyless OIDC deploys on 4 repos.</w:t>
+      </w:r>
+    </w:p>
+    <w:p>
+      <w:pPr>
+        <w:pStyle w:val="ListParagraph"/>
+        <w:numPr>
+          <w:ilvl w:val="0"/>
+          <w:numId w:val="1"/>
+        </w:numPr>
+      </w:pPr>
+      <w:r>
+        <w:rPr>
+          <w:b/>
+        </w:rPr>
+        <w:t xml:space="preserve">Sole author of the observability and accountability layer </w:t>
+      </w:r>
+      <w:r>
+        <w:t xml:space="preserve">- redacted provider-call capture, tiered audit retention, account-to-IP anomaly view, takeover alert; a composite index cut the sessions view 102s to 2.4s (43x).</w:t>
+      </w:r>
+    </w:p>
+    <w:p>
+      <w:pPr>
+        <w:pStyle w:val="ListParagraph"/>
+        <w:numPr>
+          <w:ilvl w:val="0"/>
+          <w:numId w:val="1"/>
+        </w:numPr>
+      </w:pPr>
+      <w:r>
+        <w:rPr>
+          <w:b/>
+        </w:rPr>
+        <w:t xml:space="preserve">Built, measured and pruned the team's AI tooling </w:t>
+      </w:r>
+      <w:r>
+        <w:t xml:space="preserve">- kept a Claude PR reviewer in CI across the API and portal repos, shelved a Bedrock auto-remediation service after 12 of 13 runs failed, shipped a Bedrock knowledge-base agent (curated-first retrieval, flagged SQL fallback), and designed a ticket-to-PR pipeline with human gates, not yet live.</w:t>
+      </w:r>
+    </w:p>
+    <w:p>
+      <w:pPr>
+        <w:pStyle w:val="ListParagraph"/>
+        <w:numPr>
+          <w:ilvl w:val="0"/>
+          <w:numId w:val="1"/>
+        </w:numPr>
+      </w:pPr>
+      <w:r>
+        <w:rPr>
+          <w:b/>
+        </w:rPr>
+        <w:t xml:space="preserve">Built a runtime feature-flag platform </w:t>
+      </w:r>
+      <w:r>
+        <w:t xml:space="preserve">- flags moved from build-time env vars to a MongoDB-backed runtime reader with change-stream SSE push and fail-open on outage, wired into 6 v1 tenants' admin consoles and 4 customer portals and enabled per tenant behind a gate, with a flag manifest and parity tests guarding tenants still on compile-time flags.</w:t>
       </w:r>
     </w:p>
     <w:p>
@@ -197,96 +287,6 @@
     </w:p>
     <w:p>
       <w:pPr>
-        <w:pStyle w:val="ListParagraph"/>
-        <w:numPr>
-          <w:ilvl w:val="0"/>
-          <w:numId w:val="1"/>
-        </w:numPr>
-      </w:pPr>
-      <w:r>
-        <w:rPr>
-          <w:b/>
-        </w:rPr>
-        <w:t xml:space="preserve">Built, measured and pruned the team's AI tooling </w:t>
-      </w:r>
-      <w:r>
-        <w:t xml:space="preserve">- kept a Claude PR reviewer in CI across the API and portal repos, shelved a Bedrock auto-remediation service after 12 of 13 runs failed, shipped a Bedrock knowledge-base agent (curated-first retrieval, flagged SQL fallback), and designed a ticket-to-PR pipeline with human gates, not yet live.</w:t>
-      </w:r>
-    </w:p>
-    <w:p>
-      <w:pPr>
-        <w:pStyle w:val="ListParagraph"/>
-        <w:numPr>
-          <w:ilvl w:val="0"/>
-          <w:numId w:val="1"/>
-        </w:numPr>
-      </w:pPr>
-      <w:r>
-        <w:rPr>
-          <w:b/>
-        </w:rPr>
-        <w:t xml:space="preserve">Own and operate the multi-tenant portal infrastructure as primary platform engineer </w:t>
-      </w:r>
-      <w:r>
-        <w:t xml:space="preserve">- the 11-tenant production and test fleet (7 live) - with CI/CD (Bitbucket Pipelines), CloudWatch observability, incident response, cost-attribution tooling (Cost Explorer API), a shared ALB and Fargate Spot on the test fleet.</w:t>
-      </w:r>
-    </w:p>
-    <w:p>
-      <w:pPr>
-        <w:pStyle w:val="ListParagraph"/>
-        <w:numPr>
-          <w:ilvl w:val="0"/>
-          <w:numId w:val="1"/>
-        </w:numPr>
-      </w:pPr>
-      <w:r>
-        <w:rPr>
-          <w:b/>
-        </w:rPr>
-        <w:t xml:space="preserve">Shipped the fix for an SSN identity-verification gap enabling account takeover </w:t>
-      </w:r>
-      <w:r>
-        <w:t xml:space="preserve">- the last-four plus street match resolved to the wrong person on ~2.4% of one tenant's accounts - as attempt lockout plus ZIP-based disambiguation against the brute-forceable last-4 space, flag-gated for per-tenant rollout.</w:t>
-      </w:r>
-    </w:p>
-    <w:p>
-      <w:pPr>
-        <w:pStyle w:val="ListParagraph"/>
-        <w:numPr>
-          <w:ilvl w:val="0"/>
-          <w:numId w:val="1"/>
-        </w:numPr>
-      </w:pPr>
-      <w:r>
-        <w:rPr>
-          <w:b/>
-        </w:rPr>
-        <w:t xml:space="preserve">Built a runtime feature-flag platform </w:t>
-      </w:r>
-      <w:r>
-        <w:t xml:space="preserve">- flags moved from build-time env vars to a MongoDB-backed runtime reader with change-stream SSE push and fail-open on outage, wired into 6 v1 tenants' admin consoles and 4 customer portals and enabled per tenant behind a gate, with a flag manifest and parity tests guarding tenants still on compile-time flags.</w:t>
-      </w:r>
-    </w:p>
-    <w:p>
-      <w:pPr>
-        <w:pStyle w:val="ListParagraph"/>
-        <w:numPr>
-          <w:ilvl w:val="0"/>
-          <w:numId w:val="1"/>
-        </w:numPr>
-      </w:pPr>
-      <w:r>
-        <w:rPr>
-          <w:b/>
-        </w:rPr>
-        <w:t xml:space="preserve">Owned production go-live readiness for client launches across the fleet </w:t>
-      </w:r>
-      <w:r>
-        <w:t xml:space="preserve">- environment validation, deployment, rollback planning, and stabilization.</w:t>
-      </w:r>
-    </w:p>
-    <w:p>
-      <w:pPr>
         <w:pStyle w:val="Heading3"/>
       </w:pPr>
       <w:r>
@@ -437,7 +437,7 @@
         </w:numPr>
       </w:pPr>
       <w:r>
-        <w:t xml:space="preserve">Designed and deployed a restaurant ordering and payment management system for hospitality clients (Node.js, PostgreSQL, Docker, Kubernetes).</w:t>
+        <w:t xml:space="preserve">Built features for a wholesale food and beverage ordering and payments platform (Node.js, PostgreSQL, Docker, Kubernetes).</w:t>
       </w:r>
     </w:p>
     <w:p>

</xml_diff>

<commit_message>
Content: correct live-state claims, add evidenced work, restructure cases
</commit_message>
<xml_diff>
--- a/resume/resume.docx
+++ b/resume/resume.docx
@@ -15,7 +15,7 @@
         <w:rPr>
           <w:b/>
         </w:rPr>
-        <w:t xml:space="preserve">STAFF SOFTWARE ENGINEER, PLATFORM &amp; PRODUCT | MULTI-TENANT SAAS | AWS | TERRAFORM | TYPESCRIPT | AGENTIC TOOLING</w:t>
+        <w:t xml:space="preserve">STAFF SOFTWARE ENGINEER, PLATFORM &amp; PRODUCT | AWS | TERRAFORM | TYPESCRIPT | AGENTIC TOOLING</w:t>
       </w:r>
     </w:p>
     <w:p>
@@ -65,7 +65,7 @@
     </w:p>
     <w:p>
       <w:r>
-        <w:t xml:space="preserve">Staff Software Engineer - I build the platform other engineers ship on. 8+ years in software, 5+ on AWS, 3+ as the most senior hands-on engineer on a multi-tenant SaaS platform behind 7 live utility client portals. Primary author of the Terraform control-plane the fleet is migrating onto (93%) and of both generations of its core REST API (58% of v1, which serves all of them today; 76% of v2, in production for the first tenant ahead of its cutover). Also its operator: CI/CD, observability, incident response, security remediation and cost.</w:t>
+        <w:t xml:space="preserve">Staff Software Engineer - I build the platform other engineers ship on. 8+ years in software, 5+ on AWS, 3+ years on a multi-tenant SaaS platform behind 7 live utility client portals, now its most senior hands-on engineer. Primary author of the Terraform control-plane the fleet is migrating onto (93%) and of both generations of its core REST API (58% of v1, serving six of them; 76% of v2, serving the seventh since June 2026 and beside v1 for the first migration). Also its operator: CI/CD, observability, incident response, security remediation and cost.</w:t>
       </w:r>
     </w:p>
     <w:p>
@@ -97,12 +97,7 @@
     </w:p>
     <w:p>
       <w:r>
-        <w:t xml:space="preserve">Staff Software Engineer, Platform &amp; Product | Sep 2025 - Present</w:t>
-      </w:r>
-    </w:p>
-    <w:p>
-      <w:r>
-        <w:t xml:space="preserve">Previously Senior Full-Stack Engineer (Cloud) | May 2023 - Aug 2025</w:t>
+        <w:t xml:space="preserve">Current title: Sep 2025 - Present | Previously Senior Full-Stack Engineer (Cloud): May 2023 - Aug 2025</w:t>
       </w:r>
     </w:p>
     <w:p>
@@ -120,7 +115,7 @@
         <w:t xml:space="preserve">Primary author of both generations of the fleet's core REST API </w:t>
       </w:r>
       <w:r>
-        <w:t xml:space="preserve">- 58% of v1, which serves all seven launched tenants, and 76% of v2 (Fastify, TypeScript, Zod, MongoDB on ECS Fargate), in production for the first tenant ahead of its cutover - owning the multi-tenant auth, data-access and Oracle CCS (OAuth 2.0) integration patterns both generations share.</w:t>
+        <w:t xml:space="preserve">- 58% of v1, serving six of seven launched tenants, and 76% of v2 (Fastify, TypeScript, Zod, MongoDB on ECS Fargate), serving the seventh since June 2026 and beside v1 for the first migration - owning their shared auth, data-access and Oracle CCS (OAuth 2.0) patterns.</w:t>
       </w:r>
     </w:p>
     <w:p>
@@ -156,7 +151,7 @@
         <w:t xml:space="preserve">Most senior hands-on engineer on a small product team; primary platform engineer </w:t>
       </w:r>
       <w:r>
-        <w:t xml:space="preserve">for the 11-tenant prod and test fleet (7 live) - set fleet standards (provisioning modules, CI/CD, security guardrails); run Bitbucket Pipelines, CloudWatch, incident response, Cost Explorer cost attribution, shared ALB, test-fleet Fargate Spot.</w:t>
+        <w:t xml:space="preserve">for the 11-tenant prod and test fleet (7 live) - set standards (13 accepted ADRs, provisioning modules, CI/CD, security guardrails, pre-push/pipeline gates); run Bitbucket Pipelines, CloudWatch, incident response, Cost Explorer attribution, shared ALB, test-fleet Fargate Spot.</w:t>
       </w:r>
     </w:p>
     <w:p>
@@ -192,7 +187,7 @@
         <w:t xml:space="preserve">Shipped the fix for an SSN identity-verification gap enabling account takeover </w:t>
       </w:r>
       <w:r>
-        <w:t xml:space="preserve">- the last-four plus street match resolved to the wrong person on ~2.4% of one tenant's accounts - as attempt lockout plus ZIP-based disambiguation against the brute-forceable last-4 space, flag-gated for per-tenant rollout.</w:t>
+        <w:t xml:space="preserve">- the last-four plus street match resolved to the wrong person on ~2.4% of one tenant's accounts - as attempt lockout plus ZIP-based disambiguation, flag-gated for per-tenant rollout.</w:t>
       </w:r>
     </w:p>
     <w:p>
@@ -210,40 +205,40 @@
         <w:t xml:space="preserve">Faster, stricter delivery </w:t>
       </w:r>
       <w:r>
-        <w:t xml:space="preserve">- core API pipeline ~12 to ~7 min (esbuild transpile, cache-mounted installs, fail-fast), admin portal ~10 to ~6 min (April 2026), plus blocking portal Snyk gates and keyless OIDC deploys on 4 repos.</w:t>
-      </w:r>
-    </w:p>
-    <w:p>
-      <w:pPr>
-        <w:pStyle w:val="ListParagraph"/>
-        <w:numPr>
-          <w:ilvl w:val="0"/>
-          <w:numId w:val="1"/>
-        </w:numPr>
-      </w:pPr>
-      <w:r>
-        <w:rPr>
-          <w:b/>
-        </w:rPr>
-        <w:t xml:space="preserve">Sole author of the observability and accountability layer </w:t>
-      </w:r>
-      <w:r>
-        <w:t xml:space="preserve">- redacted provider-call capture, tiered audit retention, account-to-IP anomaly view, takeover alert; a composite index cut the sessions view 102s to 2.4s (43x).</w:t>
-      </w:r>
-    </w:p>
-    <w:p>
-      <w:pPr>
-        <w:pStyle w:val="ListParagraph"/>
-        <w:numPr>
-          <w:ilvl w:val="0"/>
-          <w:numId w:val="1"/>
-        </w:numPr>
-      </w:pPr>
-      <w:r>
-        <w:rPr>
-          <w:b/>
-        </w:rPr>
-        <w:t xml:space="preserve">Built, measured and pruned the team's AI tooling </w:t>
+        <w:t xml:space="preserve">- core API CI ~12 to ~7 min (esbuild, cache-mounted installs, fail-fast), admin portal ~10 to ~6 min (April 2026), plus blocking Snyk gates (newer portals, both APIs) and keyless OIDC deploys on 4 repos.</w:t>
+      </w:r>
+    </w:p>
+    <w:p>
+      <w:pPr>
+        <w:pStyle w:val="ListParagraph"/>
+        <w:numPr>
+          <w:ilvl w:val="0"/>
+          <w:numId w:val="1"/>
+        </w:numPr>
+      </w:pPr>
+      <w:r>
+        <w:rPr>
+          <w:b/>
+        </w:rPr>
+        <w:t xml:space="preserve">Sole author of the observability/accountability layer </w:t>
+      </w:r>
+      <w:r>
+        <w:t xml:space="preserve">- provider-call capture (redacted on v2), tiered audit retention, account-to-IP anomaly view, takeover alert; a composite index cut the sessions view 102s to 2.4s (43x).</w:t>
+      </w:r>
+    </w:p>
+    <w:p>
+      <w:pPr>
+        <w:pStyle w:val="ListParagraph"/>
+        <w:numPr>
+          <w:ilvl w:val="0"/>
+          <w:numId w:val="1"/>
+        </w:numPr>
+      </w:pPr>
+      <w:r>
+        <w:rPr>
+          <w:b/>
+        </w:rPr>
+        <w:t xml:space="preserve">Built and pruned the team's AI tooling </w:t>
       </w:r>
       <w:r>
         <w:t xml:space="preserve">- kept a Claude PR reviewer in CI across the API and portal repos, shelved a Bedrock auto-remediation service after 12 of 13 runs failed, shipped a Bedrock knowledge-base agent (curated-first retrieval, flagged SQL fallback), and designed a ticket-to-PR pipeline with human gates, not yet live.</w:t>
@@ -264,25 +259,25 @@
         <w:t xml:space="preserve">Built a runtime feature-flag platform </w:t>
       </w:r>
       <w:r>
-        <w:t xml:space="preserve">- flags moved from build-time env vars to a MongoDB-backed runtime reader with change-stream SSE push and fail-open on outage, wired into 6 v1 tenants' admin consoles and 4 customer portals and enabled per tenant behind a gate, with a flag manifest and parity tests guarding tenants still on compile-time flags.</w:t>
-      </w:r>
-    </w:p>
-    <w:p>
-      <w:pPr>
-        <w:pStyle w:val="ListParagraph"/>
-        <w:numPr>
-          <w:ilvl w:val="0"/>
-          <w:numId w:val="1"/>
-        </w:numPr>
-      </w:pPr>
-      <w:r>
-        <w:rPr>
-          <w:b/>
-        </w:rPr>
-        <w:t xml:space="preserve">Own the reconciliation between systems of record </w:t>
-      </w:r>
-      <w:r>
-        <w:t xml:space="preserve">- a CCS/Invoice Cloud reconciler (scheduled Lambda: detection-only reconcile, guarded desync repair, per-tenant queries, pre-flight link checks, split-identity healing) that replaced the batch sync I switched off, plus a dry-run-default duplicate-login reconciler with a daily read-only prod sweep.</w:t>
+        <w:t xml:space="preserve">- MongoDB-backed reader replacing build-time env vars, wired into 6 v1 admin consoles and 4 portals, enabled per tenant.</w:t>
+      </w:r>
+    </w:p>
+    <w:p>
+      <w:pPr>
+        <w:pStyle w:val="ListParagraph"/>
+        <w:numPr>
+          <w:ilvl w:val="0"/>
+          <w:numId w:val="1"/>
+        </w:numPr>
+      </w:pPr>
+      <w:r>
+        <w:rPr>
+          <w:b/>
+        </w:rPr>
+        <w:t xml:space="preserve">Own the CCS/Invoice Cloud reconciler </w:t>
+      </w:r>
+      <w:r>
+        <w:t xml:space="preserve">- detection-only by default, guarded repair - that replaced the batch sync I switched off.</w:t>
       </w:r>
     </w:p>
     <w:p>
@@ -349,7 +344,7 @@
         <w:t xml:space="preserve">Serialized concurrent writes and killed data races: </w:t>
       </w:r>
       <w:r>
-        <w:t xml:space="preserve">wrapped rating upserts in a transaction behind a Postgres advisory lock (pg_advisory_xact_lock), fixed a duplicate-row race in a GraphQL sync resolver, blocked re-entrant AI generation calls, made optimistic cache creates idempotent by id, and reconciled stale polls that hid new rows.</w:t>
+        <w:t xml:space="preserve">wrapped rating upserts in a transaction behind a Postgres advisory lock (pg_advisory_xact_lock) and fixed a duplicate-row race in a GraphQL sync resolver.</w:t>
       </w:r>
     </w:p>
     <w:p>
@@ -367,19 +362,25 @@
         <w:t xml:space="preserve">Built the in-house observability layer: </w:t>
       </w:r>
       <w:r>
-        <w:t xml:space="preserve">an Apollo plugin emitting one structured obs_event per GraphQL operation to CloudWatch, an errClass fault/reject/noise scheme, staging and production dashboards, Beanstalk logs streamed to CloudWatch, Sentry hardened (tunnel, sourcemaps, gated replay) - then removed a dead-pipe New Relic billing ~$176/month.</w:t>
-      </w:r>
-    </w:p>
-    <w:p>
-      <w:pPr>
-        <w:pStyle w:val="ListParagraph"/>
-        <w:numPr>
-          <w:ilvl w:val="0"/>
-          <w:numId w:val="1"/>
-        </w:numPr>
-      </w:pPr>
-      <w:r>
-        <w:t xml:space="preserve">Contributed to real-time collaboration (GraphQL subscriptions), OpenAI-backed generation and platform security (OWASP/IDOR, JWT sessions); built AI Context Configuration - a per-strategy assistant response mode only a non-external strategy lead can choose - plus a Notion-backed assistant knowledge base and AI-endpoint hardening.</w:t>
+        <w:t xml:space="preserve">an Apollo plugin emitting one structured obs_event per GraphQL operation to CloudWatch, an errClass fault/reject/noise scheme, staging and production dashboards, Beanstalk logs streamed to CloudWatch, Sentry hardened (tunnel, sourcemaps, gated replay) - then removed New Relic.</w:t>
+      </w:r>
+    </w:p>
+    <w:p>
+      <w:pPr>
+        <w:pStyle w:val="ListParagraph"/>
+        <w:numPr>
+          <w:ilvl w:val="0"/>
+          <w:numId w:val="1"/>
+        </w:numPr>
+      </w:pPr>
+      <w:r>
+        <w:rPr>
+          <w:b/>
+        </w:rPr>
+        <w:t xml:space="preserve">Built AI Context Configuration </w:t>
+      </w:r>
+      <w:r>
+        <w:t xml:space="preserve">- a per-strategy assistant response mode only a non-external strategy lead can choose - plus a Notion-backed assistant knowledge base and AI-endpoint hardening; contributed to real-time collaboration (GraphQL subscriptions), OpenAI-backed generation and platform security (OWASP/IDOR, JWT sessions).</w:t>
       </w:r>
     </w:p>
     <w:p>
@@ -531,7 +532,7 @@
         <w:t xml:space="preserve">Cloud &amp; Infra: </w:t>
       </w:r>
       <w:r>
-        <w:t xml:space="preserve">AWS - ECS Fargate, CloudFront, Cognito, ElastiCache, KMS, Secrets Manager, WAFv2, SES, S3, Route 53, VPC, ALB, IAM, Elastic Beanstalk, Terraform, Docker, Linux</w:t>
+        <w:t xml:space="preserve">AWS - ECS Fargate, Lambda, CloudFront, Cognito, DynamoDB, EventBridge, ElastiCache, Secrets Manager, WAFv2, SES, S3, Route 53, VPC, ALB, IAM, Elastic Beanstalk, Terraform, Docker, Linux</w:t>
       </w:r>
     </w:p>
     <w:p>
@@ -575,7 +576,7 @@
         <w:t xml:space="preserve">Observability &amp; Security: </w:t>
       </w:r>
       <w:r>
-        <w:t xml:space="preserve">Datadog RUM/APM, CloudWatch, Sentry, Structured logging, Session Replay, OWASP/IDOR, JWT, OAuth 2.0, OIDC, IAM, WAFv2, Snyk, Pentest remediation</w:t>
+        <w:t xml:space="preserve">Datadog RUM/APM, CloudWatch, CloudWatch Synthetics, Sentry, Structured logging, Session Replay, OWASP/IDOR, JWT, OAuth 2.0, OIDC, IAM, WAFv2, Snyk, Pentest remediation</w:t>
       </w:r>
     </w:p>
     <w:p>
@@ -586,7 +587,7 @@
         <w:t xml:space="preserve">Frontend: </w:t>
       </w:r>
       <w:r>
-        <w:t xml:space="preserve">React, Redux, TypeScript, Styled Components, Tailwind, Next.js</w:t>
+        <w:t xml:space="preserve">React, Next.js, TypeScript, MUI, Styled Components, Tailwind, React Native (Expo), Accessibility (WCAG 2.1 AA)</w:t>
       </w:r>
     </w:p>
     <w:p>
@@ -597,7 +598,7 @@
         <w:t xml:space="preserve">Practices: </w:t>
       </w:r>
       <w:r>
-        <w:t xml:space="preserve">Platform Engineering, Infrastructure-as-Code, System Design &amp; Architecture, Security &amp; Compliance, Incident Response</w:t>
+        <w:t xml:space="preserve">Platform Engineering, Infrastructure-as-Code (IaC), System Design &amp; Architecture, Security &amp; Compliance, Incident Response</w:t>
       </w:r>
     </w:p>
     <w:p>

</xml_diff>

<commit_message>
Profile: state EU work authorization on the resume and site
</commit_message>
<xml_diff>
--- a/resume/resume.docx
+++ b/resume/resume.docx
@@ -21,6 +21,12 @@
     <w:p>
       <w:r>
         <w:t xml:space="preserve">Italy (Remote, CET)</w:t>
+      </w:r>
+      <w:r>
+        <w:t xml:space="preserve"> | </w:t>
+      </w:r>
+      <w:r>
+        <w:t xml:space="preserve">EU work authorization</w:t>
       </w:r>
       <w:r>
         <w:t xml:space="preserve"> | </w:t>

</xml_diff>